<commit_message>
added esercizi classroom anno scorso
</commit_message>
<xml_diff>
--- a/lezioni/programma/programma_IeFP.docx
+++ b/lezioni/programma/programma_IeFP.docx
@@ -1984,13 +1984,14 @@
           <w:p>
             <w:pPr>
               <w:spacing w:line="276" w:lineRule="auto"/>
-              <w:rPr/>
-            </w:pPr>
-            <w:r>
-              <w:rPr>
-                <w:rtl w:val="0"/>
-              </w:rPr>
-              <w:t xml:space="preserve">Realizzazione di un videogioco utilizzando il software Scratch.</w:t>
+            </w:pPr>
+            <w:r>
+              <w:rPr>
+                <w:rFonts w:ascii="Arial" w:hAnsi="Arial" w:eastAsia="Arial" w:cs="Arial"/>
+                <w:sz w:val="22"/>
+                <w:szCs w:val="22"/>
+              </w:rPr>
+              <w:t>Realizzazione di un videogioco/animazione utilizzando il software Scratch per la sponsorizzazione di un prodotto o l'animazione di un logo aziendale.</w:t>
             </w:r>
           </w:p>
         </w:tc>

</xml_diff>